<commit_message>
Add Why explanations to all 22 MCQ answers in mock exam answer key
Each MCQ in DSAI4205_Mock_Exam_ANSWERS.docx now shows a blue italic
"Why:" line explaining the correct answer, why distractors are wrong,
and Dr. Fong's specific warnings where relevant (shuffle step, M=half-window,
source-at-top orientation, etc).

Co-Authored-By: Claude Sonnet 4.6 <noreply@anthropic.com>
</commit_message>
<xml_diff>
--- a/DSAI4205_Mock_Exam_ANSWERS.docx
+++ b/DSAI4205_Mock_Exam_ANSWERS.docx
@@ -219,6 +219,28 @@
         <w:t>D)  The usefulness of the data for business decision making</w:t>
       </w:r>
     </w:p>
+    <w:p>
+      <w:pPr>
+        <w:spacing w:after="120"/>
+        <w:ind w:left="454"/>
+      </w:pPr>
+      <w:r>
+        <w:rPr>
+          <w:b/>
+          <w:color w:val="1D4ED8"/>
+          <w:sz w:val="18"/>
+        </w:rPr>
+        <w:t xml:space="preserve">Why: </w:t>
+      </w:r>
+      <w:r>
+        <w:rPr>
+          <w:i/>
+          <w:color w:val="1E40AF"/>
+          <w:sz w:val="18"/>
+        </w:rPr>
+        <w:t>Veracity = quality/trustworthiness of data (e.g. measurement errors, noisy feedback). A = Volume. B = Variety. D = Value.</w:t>
+      </w:r>
+    </w:p>
     <w:p/>
     <w:p>
       <w:pPr>
@@ -281,6 +303,28 @@
         <w:t>D)  Veracity</w:t>
       </w:r>
     </w:p>
+    <w:p>
+      <w:pPr>
+        <w:spacing w:after="120"/>
+        <w:ind w:left="454"/>
+      </w:pPr>
+      <w:r>
+        <w:rPr>
+          <w:b/>
+          <w:color w:val="1D4ED8"/>
+          <w:sz w:val="18"/>
+        </w:rPr>
+        <w:t xml:space="preserve">Why: </w:t>
+      </w:r>
+      <w:r>
+        <w:rPr>
+          <w:i/>
+          <w:color w:val="1E40AF"/>
+          <w:sz w:val="18"/>
+        </w:rPr>
+        <w:t>Volume = sheer amount of data (petabytes, millions of records). Velocity would apply if the focus were on how fast data arrives or must be processed. 2 petabytes daily describes size, not speed.</w:t>
+      </w:r>
+    </w:p>
     <w:p/>
     <w:p>
       <w:pPr>
@@ -343,6 +387,28 @@
         <w:t>D)  5</w:t>
       </w:r>
     </w:p>
+    <w:p>
+      <w:pPr>
+        <w:spacing w:after="120"/>
+        <w:ind w:left="454"/>
+      </w:pPr>
+      <w:r>
+        <w:rPr>
+          <w:b/>
+          <w:color w:val="1D4ED8"/>
+          <w:sz w:val="18"/>
+        </w:rPr>
+        <w:t xml:space="preserve">Why: </w:t>
+      </w:r>
+      <w:r>
+        <w:rPr>
+          <w:i/>
+          <w:color w:val="1E40AF"/>
+          <w:sz w:val="18"/>
+        </w:rPr>
+        <w:t>HDFS uses 3-way replication by default: one copy on the local node, and two copies on other nodes (usually on different racks). If one node fails, data is still available from the other two.</w:t>
+      </w:r>
+    </w:p>
     <w:p/>
     <w:p>
       <w:pPr>
@@ -405,6 +471,28 @@
         <w:t>D)  Synchronous — blocks the thread until all chunks are processed</w:t>
       </w:r>
     </w:p>
+    <w:p>
+      <w:pPr>
+        <w:spacing w:after="120"/>
+        <w:ind w:left="454"/>
+      </w:pPr>
+      <w:r>
+        <w:rPr>
+          <w:b/>
+          <w:color w:val="1D4ED8"/>
+          <w:sz w:val="18"/>
+        </w:rPr>
+        <w:t xml:space="preserve">Why: </w:t>
+      </w:r>
+      <w:r>
+        <w:rPr>
+          <w:i/>
+          <w:color w:val="1E40AF"/>
+          <w:sz w:val="18"/>
+        </w:rPr>
+        <w:t>Dask is lazy: operations like ddf.groupby().sum() do NOT run immediately — they build a task graph (logical plan). Execution only happens when you call .compute(). This is identical to Spark's transformation vs action model.</w:t>
+      </w:r>
+    </w:p>
     <w:p/>
     <w:p>
       <w:pPr>
@@ -467,6 +555,28 @@
         <w:t>D)  Incorrect numerical results due to floating point errors</w:t>
       </w:r>
     </w:p>
+    <w:p>
+      <w:pPr>
+        <w:spacing w:after="120"/>
+        <w:ind w:left="454"/>
+      </w:pPr>
+      <w:r>
+        <w:rPr>
+          <w:b/>
+          <w:color w:val="1D4ED8"/>
+          <w:sz w:val="18"/>
+        </w:rPr>
+        <w:t xml:space="preserve">Why: </w:t>
+      </w:r>
+      <w:r>
+        <w:rPr>
+          <w:i/>
+          <w:color w:val="1E40AF"/>
+          <w:sz w:val="18"/>
+        </w:rPr>
+        <w:t>Tiny chunks = millions of tiny tasks. Each task has a fixed scheduling overhead. At some point you spend more time managing tasks than doing actual computation. A is the opposite problem (chunks too LARGE).</w:t>
+      </w:r>
+    </w:p>
     <w:p/>
     <w:p>
       <w:pPr>
@@ -529,6 +639,28 @@
         <w:t>D)  {"big": 2, "data": 1}</w:t>
       </w:r>
     </w:p>
+    <w:p>
+      <w:pPr>
+        <w:spacing w:after="120"/>
+        <w:ind w:left="454"/>
+      </w:pPr>
+      <w:r>
+        <w:rPr>
+          <w:b/>
+          <w:color w:val="1D4ED8"/>
+          <w:sz w:val="18"/>
+        </w:rPr>
+        <w:t xml:space="preserve">Why: </w:t>
+      </w:r>
+      <w:r>
+        <w:rPr>
+          <w:i/>
+          <w:color w:val="1E40AF"/>
+          <w:sz w:val="18"/>
+        </w:rPr>
+        <w:t>The mapper processes each word INDEPENDENTLY and emits (word, 1) for every occurrence — it does NOT aggregate. Aggregation happens in the reducer. A is the reducer output. C treats the whole sentence as one key. D is a Python dict, not a key-value pair stream.</w:t>
+      </w:r>
+    </w:p>
     <w:p/>
     <w:p>
       <w:pPr>
@@ -591,6 +723,28 @@
         <w:t>D)  Reduce</w:t>
       </w:r>
     </w:p>
+    <w:p>
+      <w:pPr>
+        <w:spacing w:after="120"/>
+        <w:ind w:left="454"/>
+      </w:pPr>
+      <w:r>
+        <w:rPr>
+          <w:b/>
+          <w:color w:val="1D4ED8"/>
+          <w:sz w:val="18"/>
+        </w:rPr>
+        <w:t xml:space="preserve">Why: </w:t>
+      </w:r>
+      <w:r>
+        <w:rPr>
+          <w:i/>
+          <w:color w:val="1E40AF"/>
+          <w:sz w:val="18"/>
+        </w:rPr>
+        <w:t>Shuffle and Sort is done entirely by the MapReduce framework. It groups all values for the same key together and sorts by key before passing to reducers. Dr. Fong warned: many students forget to mention this stage in exam answers.</w:t>
+      </w:r>
+    </w:p>
     <w:p/>
     <w:p>
       <w:pPr>
@@ -653,6 +807,28 @@
         <w:t>D)  MapReduce loads the entire dataset into RAM before processing</w:t>
       </w:r>
     </w:p>
+    <w:p>
+      <w:pPr>
+        <w:spacing w:after="120"/>
+        <w:ind w:left="454"/>
+      </w:pPr>
+      <w:r>
+        <w:rPr>
+          <w:b/>
+          <w:color w:val="1D4ED8"/>
+          <w:sz w:val="18"/>
+        </w:rPr>
+        <w:t xml:space="preserve">Why: </w:t>
+      </w:r>
+      <w:r>
+        <w:rPr>
+          <w:i/>
+          <w:color w:val="1E40AF"/>
+          <w:sz w:val="18"/>
+        </w:rPr>
+        <w:t>After every mapper finishes, results are written to HDFS (replicated 3×). This disk I/O is the bottleneck — even a single extra stage means 6 disk writes (3 write + 3 read). Spark keeps intermediate RDDs in RAM, avoiding this entirely.</w:t>
+      </w:r>
+    </w:p>
     <w:p/>
     <w:p>
       <w:pPr>
@@ -715,6 +891,28 @@
         <w:t>D)  join()</w:t>
       </w:r>
     </w:p>
+    <w:p>
+      <w:pPr>
+        <w:spacing w:after="120"/>
+        <w:ind w:left="454"/>
+      </w:pPr>
+      <w:r>
+        <w:rPr>
+          <w:b/>
+          <w:color w:val="1D4ED8"/>
+          <w:sz w:val="18"/>
+        </w:rPr>
+        <w:t xml:space="preserve">Why: </w:t>
+      </w:r>
+      <w:r>
+        <w:rPr>
+          <w:i/>
+          <w:color w:val="1E40AF"/>
+          <w:sz w:val="18"/>
+        </w:rPr>
+        <w:t>Narrow = each output partition depends on only ONE input partition — no data moves across the network. filter(), map(), flatMap() are narrow. groupByKey(), reduceByKey(), join() are WIDE — they require a shuffle because keys from all partitions must be collected together.</w:t>
+      </w:r>
+    </w:p>
     <w:p/>
     <w:p>
       <w:pPr>
@@ -777,6 +975,28 @@
         <w:t>D)  mapValues() is faster because it skips serialization</w:t>
       </w:r>
     </w:p>
+    <w:p>
+      <w:pPr>
+        <w:spacing w:after="120"/>
+        <w:ind w:left="454"/>
+      </w:pPr>
+      <w:r>
+        <w:rPr>
+          <w:b/>
+          <w:color w:val="1D4ED8"/>
+          <w:sz w:val="18"/>
+        </w:rPr>
+        <w:t xml:space="preserve">Why: </w:t>
+      </w:r>
+      <w:r>
+        <w:rPr>
+          <w:i/>
+          <w:color w:val="1E40AF"/>
+          <w:sz w:val="18"/>
+        </w:rPr>
+        <w:t>mapValues() only transforms the VALUE in a (key, value) pair — the key is untouched. This also preserves partitioning (no shuffle). map() transforms the ENTIRE element, so a (k, v) pair could become anything. Both are lazy transformations (A is wrong).</w:t>
+      </w:r>
+    </w:p>
     <w:p/>
     <w:p>
       <w:pPr>
@@ -839,6 +1059,28 @@
         <w:t>D)  Increasing the number of partitions before every join</w:t>
       </w:r>
     </w:p>
+    <w:p>
+      <w:pPr>
+        <w:spacing w:after="120"/>
+        <w:ind w:left="454"/>
+      </w:pPr>
+      <w:r>
+        <w:rPr>
+          <w:b/>
+          <w:color w:val="1D4ED8"/>
+          <w:sz w:val="18"/>
+        </w:rPr>
+        <w:t xml:space="preserve">Why: </w:t>
+      </w:r>
+      <w:r>
+        <w:rPr>
+          <w:i/>
+          <w:color w:val="1E40AF"/>
+          <w:sz w:val="18"/>
+        </w:rPr>
+        <w:t>Catalyst automatically applies: predicate pushdown (filter early before a join/scan), column pruning (only read columns you actually use), join reordering, and constant folding. Python UDFs (C) are actually a WEAKNESS of DataFrames — they can't be optimised by Catalyst.</w:t>
+      </w:r>
+    </w:p>
     <w:p/>
     <w:p>
       <w:pPr>
@@ -901,6 +1143,28 @@
         <w:t>D)  Both RDD and DataFrame support SQL-style queries natively</w:t>
       </w:r>
     </w:p>
+    <w:p>
+      <w:pPr>
+        <w:spacing w:after="120"/>
+        <w:ind w:left="454"/>
+      </w:pPr>
+      <w:r>
+        <w:rPr>
+          <w:b/>
+          <w:color w:val="1D4ED8"/>
+          <w:sz w:val="18"/>
+        </w:rPr>
+        <w:t xml:space="preserve">Why: </w:t>
+      </w:r>
+      <w:r>
+        <w:rPr>
+          <w:i/>
+          <w:color w:val="1E40AF"/>
+          <w:sz w:val="18"/>
+        </w:rPr>
+        <w:t>Catalyst only works on DataFrames — it understands the schema and can rewrite the query plan. RDDs are opaque to Spark (Spark doesn't know what your lambda function does). B is wrong: DataFrames fully support ArrayType, MapType, StructType. D is wrong: RDDs have no native SQL support.</w:t>
+      </w:r>
+    </w:p>
     <w:p/>
     <w:p>
       <w:pPr>
@@ -963,6 +1227,28 @@
         <w:t>D)  [CLS]</w:t>
       </w:r>
     </w:p>
+    <w:p>
+      <w:pPr>
+        <w:spacing w:after="120"/>
+        <w:ind w:left="454"/>
+      </w:pPr>
+      <w:r>
+        <w:rPr>
+          <w:b/>
+          <w:color w:val="1D4ED8"/>
+          <w:sz w:val="18"/>
+        </w:rPr>
+        <w:t xml:space="preserve">Why: </w:t>
+      </w:r>
+      <w:r>
+        <w:rPr>
+          <w:i/>
+          <w:color w:val="1E40AF"/>
+          <w:sz w:val="18"/>
+        </w:rPr>
+        <w:t>[UNK] (unknown) is used when a character or subword was never seen during BPE training, so it has no entry in the vocabulary. In Dr. Fong's slides this appears as "?". [MASK] is used in BERT for masked language modelling. [PAD] pads sequences to equal length. [CLS] marks the start of a sequence in BERT.</w:t>
+      </w:r>
+    </w:p>
     <w:p/>
     <w:p>
       <w:pPr>
@@ -1025,6 +1311,28 @@
         <w:t>D)  Lemmatisation is faster but less accurate than stemming</w:t>
       </w:r>
     </w:p>
+    <w:p>
+      <w:pPr>
+        <w:spacing w:after="120"/>
+        <w:ind w:left="454"/>
+      </w:pPr>
+      <w:r>
+        <w:rPr>
+          <w:b/>
+          <w:color w:val="1D4ED8"/>
+          <w:sz w:val="18"/>
+        </w:rPr>
+        <w:t xml:space="preserve">Why: </w:t>
+      </w:r>
+      <w:r>
+        <w:rPr>
+          <w:i/>
+          <w:color w:val="1E40AF"/>
+          <w:sz w:val="18"/>
+        </w:rPr>
+        <w:t>Stemming chops word endings using rules (Porter stemmer): "studies" → "studi" — not a real word. Lemmatisation looks up the true base form in a dictionary: "studies" → "study". The output of lemmatisation is always a valid English word. A has it backwards. C has it backwards. D has speed/accuracy backwards too.</w:t>
+      </w:r>
+    </w:p>
     <w:p/>
     <w:p>
       <w:pPr>
@@ -1087,6 +1395,28 @@
         <w:t>D)  Diagonally from top-left to bottom-right</w:t>
       </w:r>
     </w:p>
+    <w:p>
+      <w:pPr>
+        <w:spacing w:after="120"/>
+        <w:ind w:left="454"/>
+      </w:pPr>
+      <w:r>
+        <w:rPr>
+          <w:b/>
+          <w:color w:val="1D4ED8"/>
+          <w:sz w:val="18"/>
+        </w:rPr>
+        <w:t xml:space="preserve">Why: </w:t>
+      </w:r>
+      <w:r>
+        <w:rPr>
+          <w:i/>
+          <w:color w:val="1E40AF"/>
+          <w:sz w:val="18"/>
+        </w:rPr>
+        <w:t>Dr. Fong's direct warning: SOURCE word = TOP (columns), TARGET word = LEFT (rows). Every semester students mix these up and get the entire question wrong. C is technically true for the final distance value, but the DP fill direction matters for showing working.</w:t>
+      </w:r>
+    </w:p>
     <w:p/>
     <w:p>
       <w:pPr>
@@ -1149,6 +1479,28 @@
         <w:t>D)  8</w:t>
       </w:r>
     </w:p>
+    <w:p>
+      <w:pPr>
+        <w:spacing w:after="120"/>
+        <w:ind w:left="454"/>
+      </w:pPr>
+      <w:r>
+        <w:rPr>
+          <w:b/>
+          <w:color w:val="1D4ED8"/>
+          <w:sz w:val="18"/>
+        </w:rPr>
+        <w:t xml:space="preserve">Why: </w:t>
+      </w:r>
+      <w:r>
+        <w:rPr>
+          <w:i/>
+          <w:color w:val="1E40AF"/>
+          <w:sz w:val="18"/>
+        </w:rPr>
+        <w:t>M is the HALF-window size. M=2 means 2 words to the LEFT and 2 words to the RIGHT of the centre word, giving 2M = 4 total context words. Dr. Fong explicitly warned: M=2 means 4 context words, not 2. CBOW averages these 4 embeddings and divides by 2M=4.</w:t>
+      </w:r>
+    </w:p>
     <w:p/>
     <w:p>
       <w:pPr>
@@ -1211,6 +1563,28 @@
         <w:t>D)  To prevent the centre word from appearing in the context</w:t>
       </w:r>
     </w:p>
+    <w:p>
+      <w:pPr>
+        <w:spacing w:after="120"/>
+        <w:ind w:left="454"/>
+      </w:pPr>
+      <w:r>
+        <w:rPr>
+          <w:b/>
+          <w:color w:val="1D4ED8"/>
+          <w:sz w:val="18"/>
+        </w:rPr>
+        <w:t xml:space="preserve">Why: </w:t>
+      </w:r>
+      <w:r>
+        <w:rPr>
+          <w:i/>
+          <w:color w:val="1E40AF"/>
+          <w:sz w:val="18"/>
+        </w:rPr>
+        <w:t>The raw dot-product scores can be any real number (positive or negative). Softmax: (1) applies exp() to guarantee all values are positive, then (2) divides by the sum so all values sum to 1 — turning them into a probability distribution over the vocabulary. This lets us compute cross-entropy loss and train via backpropagation.</w:t>
+      </w:r>
+    </w:p>
     <w:p/>
     <w:p>
       <w:pPr>
@@ -1273,6 +1647,28 @@
         <w:t>D)  A cross-entropy loss over the top-1000 most frequent words</w:t>
       </w:r>
     </w:p>
+    <w:p>
+      <w:pPr>
+        <w:spacing w:after="120"/>
+        <w:ind w:left="454"/>
+      </w:pPr>
+      <w:r>
+        <w:rPr>
+          <w:b/>
+          <w:color w:val="1D4ED8"/>
+          <w:sz w:val="18"/>
+        </w:rPr>
+        <w:t xml:space="preserve">Why: </w:t>
+      </w:r>
+      <w:r>
+        <w:rPr>
+          <w:i/>
+          <w:color w:val="1E40AF"/>
+          <w:sz w:val="18"/>
+        </w:rPr>
+        <w:t>Full softmax over a vocabulary of 100k+ words is too slow (denominator sums over ALL words). SGNS instead: for each real (centre, context) pair, sample k random "negative" words that did NOT appear nearby. Train a binary sigmoid classifier: real pair → 1, negative pair → 0. Much faster — only k+1 updates per training example instead of V.</w:t>
+      </w:r>
+    </w:p>
     <w:p/>
     <w:p>
       <w:pPr>
@@ -1335,6 +1731,28 @@
         <w:t>D)  1/N</w:t>
       </w:r>
     </w:p>
+    <w:p>
+      <w:pPr>
+        <w:spacing w:after="120"/>
+        <w:ind w:left="454"/>
+      </w:pPr>
+      <w:r>
+        <w:rPr>
+          <w:b/>
+          <w:color w:val="1D4ED8"/>
+          <w:sz w:val="18"/>
+        </w:rPr>
+        <w:t xml:space="preserve">Why: </w:t>
+      </w:r>
+      <w:r>
+        <w:rPr>
+          <w:i/>
+          <w:color w:val="1E40AF"/>
+          <w:sz w:val="18"/>
+        </w:rPr>
+        <w:t>The column for node X represents the probability distribution of where a random walker goes WHEN they are currently at X. Probabilities must sum to 1. Each non-zero entry = 1/out-degree(X). If all columns sum to 1, M is called column-stochastic, and the power iteration is guaranteed to converge.</w:t>
+      </w:r>
+    </w:p>
     <w:p/>
     <w:p>
       <w:pPr>
@@ -1397,6 +1815,28 @@
         <w:t>D)  Only the dead-end nodes lose all their rank</w:t>
       </w:r>
     </w:p>
+    <w:p>
+      <w:pPr>
+        <w:spacing w:after="120"/>
+        <w:ind w:left="454"/>
+      </w:pPr>
+      <w:r>
+        <w:rPr>
+          <w:b/>
+          <w:color w:val="1D4ED8"/>
+          <w:sz w:val="18"/>
+        </w:rPr>
+        <w:t xml:space="preserve">Why: </w:t>
+      </w:r>
+      <w:r>
+        <w:rPr>
+          <w:i/>
+          <w:color w:val="1E40AF"/>
+          <w:sz w:val="18"/>
+        </w:rPr>
+        <w:t>A spider trap is a set of pages that link only to each other (a closed cycle). With each iteration, rank flows INTO the trap but never flows OUT. Eventually all rank is absorbed by the trap — every page outside gets rank 0. D describes the dead-end problem, which is different.</w:t>
+      </w:r>
+    </w:p>
     <w:p/>
     <w:p>
       <w:pPr>
@@ -1459,6 +1899,28 @@
         <w:t>D)  1.00</w:t>
       </w:r>
     </w:p>
+    <w:p>
+      <w:pPr>
+        <w:spacing w:after="120"/>
+        <w:ind w:left="454"/>
+      </w:pPr>
+      <w:r>
+        <w:rPr>
+          <w:b/>
+          <w:color w:val="1D4ED8"/>
+          <w:sz w:val="18"/>
+        </w:rPr>
+        <w:t xml:space="preserve">Why: </w:t>
+      </w:r>
+      <w:r>
+        <w:rPr>
+          <w:i/>
+          <w:color w:val="1E40AF"/>
+          <w:sz w:val="18"/>
+        </w:rPr>
+        <w:t>Formula: C(v) = 2·m_v / (d_v·(d_v−1)) where m_v = edges among neighbours, d_v = degree of v. C(v) = 2×3 / (4×3) = 6/12 = 0.50. If all 4 neighbours were connected to each other (6 edges), C(v) = 1.0 (complete clique). Here only 3 of 6 possible edges exist → 0.50.</w:t>
+      </w:r>
+    </w:p>
     <w:p/>
     <w:p>
       <w:pPr>
@@ -1521,6 +1983,28 @@
         <w:t>D)  Durability of committed writes</w:t>
       </w:r>
     </w:p>
+    <w:p>
+      <w:pPr>
+        <w:spacing w:after="120"/>
+        <w:ind w:left="454"/>
+      </w:pPr>
+      <w:r>
+        <w:rPr>
+          <w:b/>
+          <w:color w:val="1D4ED8"/>
+          <w:sz w:val="18"/>
+        </w:rPr>
+        <w:t xml:space="preserve">Why: </w:t>
+      </w:r>
+      <w:r>
+        <w:rPr>
+          <w:i/>
+          <w:color w:val="1E40AF"/>
+          <w:sz w:val="18"/>
+        </w:rPr>
+        <w:t>CP means: when a network partition occurs, the system LOCKS and refuses to respond rather than returning potentially stale data. This sacrifices Availability. Example: HBase, Zookeeper. When nodes can't communicate, they stop serving requests. AP systems (Cassandra, DynamoDB) do the opposite — they stay available but may return stale data.</w:t>
+      </w:r>
+    </w:p>
     <w:p/>
     <w:p>
       <w:pPr>
@@ -1581,6 +2065,28 @@
           <w:sz w:val="20"/>
         </w:rPr>
         <w:t>D)  Data is consistent only within a single data centre, not across regions</w:t>
+      </w:r>
+    </w:p>
+    <w:p>
+      <w:pPr>
+        <w:spacing w:after="120"/>
+        <w:ind w:left="454"/>
+      </w:pPr>
+      <w:r>
+        <w:rPr>
+          <w:b/>
+          <w:color w:val="1D4ED8"/>
+          <w:sz w:val="18"/>
+        </w:rPr>
+        <w:t xml:space="preserve">Why: </w:t>
+      </w:r>
+      <w:r>
+        <w:rPr>
+          <w:i/>
+          <w:color w:val="1E40AF"/>
+          <w:sz w:val="18"/>
+        </w:rPr>
+        <w:t>Eventual consistency = AP in CAP theorem. Writes propagate to replicas with a short delay. During that window you might read old data. But given "sufficient time" (usually milliseconds to seconds), all nodes converge. Instagram likes and Amazon shopping carts use this — slight staleness is acceptable. A describes STRONG consistency (CP systems).</w:t>
       </w:r>
     </w:p>
     <w:p/>

</xml_diff>